<commit_message>
aggiornamento 2026 02 13 16:49
</commit_message>
<xml_diff>
--- a/AntonioCristiano/Fust1_CV_10_Mandich_RIccardo.docx
+++ b/AntonioCristiano/Fust1_CV_10_Mandich_RIccardo.docx
@@ -107,7 +107,7 @@
         <w:t>Ve</w:t>
       </w:r>
       <w:r>
-        <w:t xml:space="preserve">)  · · +39 </w:t>
+        <w:t xml:space="preserve">)  · +39 </w:t>
       </w:r>
       <w:r>
         <w:t>370 351 3963</w:t>
@@ -369,21 +369,6 @@
         <w:spacing w:before="160" w:after="80" w:line="240" w:lineRule="auto"/>
         <w:ind w:left="-566" w:right="-607"/>
       </w:pPr>
-    </w:p>
-    <w:p>
-      <w:pPr>
-        <w:spacing w:before="160" w:after="80" w:line="240" w:lineRule="auto"/>
-        <w:ind w:left="-566" w:right="-607"/>
-      </w:pPr>
-      <w:r>
-        <w:t>[Parte da personalizzare in base all’azienda]</w:t>
-      </w:r>
-    </w:p>
-    <w:p>
-      <w:pPr>
-        <w:spacing w:before="160" w:after="80" w:line="240" w:lineRule="auto"/>
-        <w:ind w:left="-566" w:right="-607"/>
-      </w:pPr>
       <w:r>
         <w:pict w14:anchorId="7DEA107E">
           <v:rect id="_x0000_i1025" style="width:0;height:1.5pt" o:hralign="center" o:hrstd="t" o:hr="t" fillcolor="#a0a0a0" stroked="f"/>
@@ -588,15 +573,7 @@
           <w:sz w:val="26"/>
           <w:szCs w:val="26"/>
         </w:rPr>
-        <w:t xml:space="preserve">COMPETENZE TECNICHE </w:t>
-      </w:r>
-      <w:r>
-        <w:rPr>
-          <w:color w:val="000000"/>
-          <w:sz w:val="20"/>
-          <w:szCs w:val="20"/>
-        </w:rPr>
-        <w:t>(complessive che avrete già al 18 febbraio, giorno MD)</w:t>
+        <w:t>COMPETENZE TECNICHE</w:t>
       </w:r>
     </w:p>
     <w:p>
@@ -620,7 +597,19 @@
         <w:t xml:space="preserve"> • Software/strumenti: </w:t>
       </w:r>
       <w:r>
-        <w:t>VS code, intellij (e un po’ tutti i prodotti jetbrains),fogli di calcolo</w:t>
+        <w:t>VS code, intellij (e un po’ tutti i prodotti jetbrains)</w:t>
+      </w:r>
+      <w:r>
+        <w:t>, visual studio 2026</w:t>
+      </w:r>
+      <w:r>
+        <w:t>,</w:t>
+      </w:r>
+      <w:r>
+        <w:t xml:space="preserve"> </w:t>
+      </w:r>
+      <w:r>
+        <w:t>fogli di calcolo</w:t>
       </w:r>
     </w:p>
     <w:p>
@@ -661,22 +650,17 @@
         </w:rPr>
         <w:t>COMPETENZE TRASVERSALI</w:t>
       </w:r>
-      <w:r>
-        <w:rPr>
-          <w:color w:val="000000"/>
-          <w:sz w:val="20"/>
-          <w:szCs w:val="20"/>
-        </w:rPr>
-        <w:t xml:space="preserve"> (punti di forza che vi contraddistinguono)</w:t>
-      </w:r>
-    </w:p>
-    <w:p>
-      <w:pPr>
-        <w:spacing w:before="160" w:after="80" w:line="240" w:lineRule="auto"/>
-        <w:ind w:left="-566" w:right="-607"/>
-      </w:pPr>
-      <w:r>
-        <w:t>• Problem solving • Comunicazione • Adattabilità</w:t>
+    </w:p>
+    <w:p>
+      <w:pPr>
+        <w:spacing w:before="160" w:after="80" w:line="240" w:lineRule="auto"/>
+        <w:ind w:left="-566" w:right="-607"/>
+      </w:pPr>
+      <w:r>
+        <w:t>• Problem solving • Adattabilità</w:t>
+      </w:r>
+      <w:r>
+        <w:t xml:space="preserve"> </w:t>
       </w:r>
     </w:p>
     <w:p>
@@ -739,7 +723,6 @@
         <w:ind w:left="-566" w:right="-607"/>
       </w:pPr>
       <w:r>
-        <w:lastRenderedPageBreak/>
         <w:pict w14:anchorId="4F32DA49">
           <v:rect id="_x0000_i1029" style="width:0;height:1.5pt" o:hralign="center" o:hrstd="t" o:hr="t" fillcolor="#a0a0a0" stroked="f"/>
         </w:pict>
@@ -801,7 +784,22 @@
           <w:b/>
           <w:bCs/>
         </w:rPr>
-        <w:t>SIPE Scorzè – PCTO formativo (</w:t>
+        <w:lastRenderedPageBreak/>
+        <w:t>SIPE Scorzè – PCTO formativo</w:t>
+      </w:r>
+      <w:r>
+        <w:rPr>
+          <w:b/>
+          <w:bCs/>
+        </w:rPr>
+        <w:t xml:space="preserve"> scuola superiore</w:t>
+      </w:r>
+      <w:r>
+        <w:rPr>
+          <w:b/>
+          <w:bCs/>
+        </w:rPr>
+        <w:t xml:space="preserve"> (</w:t>
       </w:r>
       <w:r>
         <w:rPr>
@@ -817,17 +815,81 @@
         <w:ind w:left="-566" w:right="-607"/>
       </w:pPr>
       <w:r>
+        <w:t xml:space="preserve"> Formazione nella creazione di una web app a partire dalle basi con Springboot, ORM e Maven (accenni a angular senza nessun utilizzo pratico)</w:t>
+      </w:r>
+    </w:p>
+    <w:p>
+      <w:pPr>
+        <w:spacing w:before="160" w:after="80" w:line="240" w:lineRule="auto"/>
+        <w:ind w:left="-566" w:right="-607"/>
+      </w:pPr>
+      <w:r>
+        <w:pict w14:anchorId="6CED03A0">
+          <v:rect id="_x0000_i1030" style="width:0;height:1.5pt" o:hralign="center" o:hrstd="t" o:hr="t" fillcolor="#a0a0a0" stroked="f"/>
+        </w:pict>
+      </w:r>
+    </w:p>
+    <w:p>
+      <w:pPr>
+        <w:pStyle w:val="Heading3"/>
+        <w:keepNext w:val="0"/>
+        <w:keepLines w:val="0"/>
+        <w:spacing w:before="160" w:line="240" w:lineRule="auto"/>
+        <w:ind w:left="-566" w:right="-607"/>
+        <w:rPr>
+          <w:b/>
+          <w:bCs/>
+          <w:color w:val="000000"/>
+          <w:sz w:val="26"/>
+          <w:szCs w:val="26"/>
+        </w:rPr>
+      </w:pPr>
+      <w:bookmarkStart w:id="6" w:name="_ktjz6uhrf7u6" w:colFirst="0" w:colLast="0"/>
+      <w:bookmarkEnd w:id="6"/>
+      <w:r>
+        <w:rPr>
+          <w:b/>
+          <w:bCs/>
+          <w:color w:val="000000"/>
+          <w:sz w:val="26"/>
+          <w:szCs w:val="26"/>
+        </w:rPr>
+        <w:t>ALTRO</w:t>
+      </w:r>
+    </w:p>
+    <w:p>
+      <w:pPr>
+        <w:spacing w:before="160" w:after="80" w:line="240" w:lineRule="auto"/>
+        <w:ind w:left="-566" w:right="-607"/>
+      </w:pPr>
+      <w:r>
+        <w:t>• Hobby/interessi:</w:t>
+      </w:r>
+      <w:r>
+        <w:t xml:space="preserve"> Leggo molto, recentemente ho scoperto un gioco di carte callezionabili di star wars che essendo appena uscito non disponeva di un sito che facessa da database soddisfacente e ne ho creato uno io (UnlimitedDB.net)</w:t>
+      </w:r>
+      <w:r>
+        <w:t>, inoltre gioco a D&amp;D per cui mi sono creato un sito per gestire gli appunti del mio mondo di gioco (phandalverse.altervista.org)</w:t>
+      </w:r>
+    </w:p>
+    <w:p>
+      <w:pPr>
+        <w:keepNext/>
+        <w:spacing w:before="160" w:after="80" w:line="240" w:lineRule="auto"/>
+        <w:ind w:left="-566" w:right="-607"/>
+      </w:pPr>
+      <w:r>
         <w:rPr>
           <w:noProof/>
         </w:rPr>
         <w:drawing>
-          <wp:anchor distT="0" distB="0" distL="114300" distR="114300" simplePos="0" relativeHeight="251663360" behindDoc="1" locked="0" layoutInCell="1" allowOverlap="1" wp14:anchorId="206D72A1" wp14:editId="5F74363E">
+          <wp:anchor distT="0" distB="0" distL="114300" distR="114300" simplePos="0" relativeHeight="251663360" behindDoc="1" locked="0" layoutInCell="1" allowOverlap="1" wp14:anchorId="206D72A1" wp14:editId="03931395">
             <wp:simplePos x="0" y="0"/>
             <wp:positionH relativeFrom="page">
-              <wp:posOffset>4538345</wp:posOffset>
+              <wp:posOffset>4584065</wp:posOffset>
             </wp:positionH>
             <wp:positionV relativeFrom="paragraph">
-              <wp:posOffset>159385</wp:posOffset>
+              <wp:posOffset>1027430</wp:posOffset>
             </wp:positionV>
             <wp:extent cx="2740769" cy="4880622"/>
             <wp:effectExtent l="0" t="0" r="0" b="0"/>
@@ -877,72 +939,144 @@
         </w:drawing>
       </w:r>
       <w:r>
-        <w:t xml:space="preserve"> Formazione nella creazione di una web app a partire dalle basi con Springboot, ORM e Maven (accenni a angular senza nessun utilizzo pratico)</w:t>
-      </w:r>
-    </w:p>
-    <w:p>
-      <w:pPr>
-        <w:spacing w:before="160" w:after="80" w:line="240" w:lineRule="auto"/>
-        <w:ind w:left="-566" w:right="-607"/>
-      </w:pPr>
-      <w:r>
-        <w:pict w14:anchorId="6CED03A0">
-          <v:rect id="_x0000_i1030" style="width:0;height:1.5pt" o:hralign="center" o:hrstd="t" o:hr="t" fillcolor="#a0a0a0" stroked="f"/>
-        </w:pict>
-      </w:r>
-    </w:p>
-    <w:p>
-      <w:pPr>
-        <w:pStyle w:val="Heading3"/>
-        <w:keepNext w:val="0"/>
-        <w:keepLines w:val="0"/>
-        <w:spacing w:before="160" w:line="240" w:lineRule="auto"/>
-        <w:ind w:left="-566" w:right="-607"/>
-        <w:rPr>
-          <w:b/>
-          <w:bCs/>
-          <w:color w:val="000000"/>
-          <w:sz w:val="26"/>
-          <w:szCs w:val="26"/>
-        </w:rPr>
-      </w:pPr>
-      <w:bookmarkStart w:id="6" w:name="_ktjz6uhrf7u6" w:colFirst="0" w:colLast="0"/>
-      <w:bookmarkEnd w:id="6"/>
-      <w:r>
-        <w:rPr>
-          <w:b/>
-          <w:bCs/>
-          <w:color w:val="000000"/>
-          <w:sz w:val="26"/>
-          <w:szCs w:val="26"/>
-        </w:rPr>
-        <w:t>ALTRO</w:t>
-      </w:r>
-    </w:p>
-    <w:p>
-      <w:pPr>
-        <w:spacing w:before="160" w:after="80" w:line="240" w:lineRule="auto"/>
-        <w:ind w:left="-566" w:right="-607"/>
-        <w:rPr>
-          <w:i/>
-          <w:iCs/>
-        </w:rPr>
-      </w:pPr>
-      <w:r>
-        <w:t>• Hobby/interessi:</w:t>
-      </w:r>
-      <w:r>
-        <w:t xml:space="preserve"> Leggo molto, recentemente ho scoperto un gioco di carte callezionabili di star wars che essendo appena uscito non disponeva di un sito che facessa da database soddisfacente e ne ho creato uno io (UnlimitedDB.net)</w:t>
-      </w:r>
-      <w:r>
-        <w:t xml:space="preserve"> </w:t>
-      </w:r>
-    </w:p>
-    <w:p>
-      <w:pPr>
-        <w:spacing w:before="160" w:after="80" w:line="240" w:lineRule="auto"/>
-        <w:ind w:left="-566" w:right="-607"/>
-      </w:pPr>
+        <w:rPr>
+          <w:noProof/>
+        </w:rPr>
+        <w:drawing>
+          <wp:inline distT="0" distB="0" distL="0" distR="0" wp14:anchorId="75CC4F4B" wp14:editId="3C0D02C9">
+            <wp:extent cx="2438400" cy="2438400"/>
+            <wp:effectExtent l="0" t="0" r="0" b="0"/>
+            <wp:docPr id="1749469977" name="Picture 1" descr="A qr code on a white background that contain the link &quot;unlimiteddb.net&quot;"/>
+            <wp:cNvGraphicFramePr>
+              <a:graphicFrameLocks xmlns:a="http://schemas.openxmlformats.org/drawingml/2006/main" noChangeAspect="1"/>
+            </wp:cNvGraphicFramePr>
+            <a:graphic xmlns:a="http://schemas.openxmlformats.org/drawingml/2006/main">
+              <a:graphicData uri="http://schemas.openxmlformats.org/drawingml/2006/picture">
+                <pic:pic xmlns:pic="http://schemas.openxmlformats.org/drawingml/2006/picture">
+                  <pic:nvPicPr>
+                    <pic:cNvPr id="1749469977" name="Picture 1" descr="A qr code on a white background that contain the link &quot;unlimiteddb.net&quot;"/>
+                    <pic:cNvPicPr>
+                      <a:picLocks noChangeAspect="1" noChangeArrowheads="1"/>
+                    </pic:cNvPicPr>
+                  </pic:nvPicPr>
+                  <pic:blipFill>
+                    <a:blip r:embed="rId8">
+                      <a:extLst>
+                        <a:ext uri="{28A0092B-C50C-407E-A947-70E740481C1C}">
+                          <a14:useLocalDpi xmlns:a14="http://schemas.microsoft.com/office/drawing/2010/main" val="0"/>
+                        </a:ext>
+                      </a:extLst>
+                    </a:blip>
+                    <a:srcRect/>
+                    <a:stretch>
+                      <a:fillRect/>
+                    </a:stretch>
+                  </pic:blipFill>
+                  <pic:spPr bwMode="auto">
+                    <a:xfrm>
+                      <a:off x="0" y="0"/>
+                      <a:ext cx="2438400" cy="2438400"/>
+                    </a:xfrm>
+                    <a:prstGeom prst="rect">
+                      <a:avLst/>
+                    </a:prstGeom>
+                    <a:noFill/>
+                    <a:ln>
+                      <a:noFill/>
+                    </a:ln>
+                  </pic:spPr>
+                </pic:pic>
+              </a:graphicData>
+            </a:graphic>
+          </wp:inline>
+        </w:drawing>
+      </w:r>
+      <w:r>
+        <w:tab/>
+      </w:r>
+      <w:r>
+        <w:tab/>
+      </w:r>
+      <w:r>
+        <w:rPr>
+          <w:noProof/>
+        </w:rPr>
+        <w:drawing>
+          <wp:inline distT="0" distB="0" distL="0" distR="0" wp14:anchorId="6B6199AE" wp14:editId="137D6F0D">
+            <wp:extent cx="2438400" cy="2438400"/>
+            <wp:effectExtent l="0" t="0" r="0" b="0"/>
+            <wp:docPr id="110913726" name="Picture 2" descr="A qr code on a white background&#10;&#10;AI-generated content may be incorrect."/>
+            <wp:cNvGraphicFramePr>
+              <a:graphicFrameLocks xmlns:a="http://schemas.openxmlformats.org/drawingml/2006/main" noChangeAspect="1"/>
+            </wp:cNvGraphicFramePr>
+            <a:graphic xmlns:a="http://schemas.openxmlformats.org/drawingml/2006/main">
+              <a:graphicData uri="http://schemas.openxmlformats.org/drawingml/2006/picture">
+                <pic:pic xmlns:pic="http://schemas.openxmlformats.org/drawingml/2006/picture">
+                  <pic:nvPicPr>
+                    <pic:cNvPr id="110913726" name="Picture 2" descr="A qr code on a white background&#10;&#10;AI-generated content may be incorrect."/>
+                    <pic:cNvPicPr>
+                      <a:picLocks noChangeAspect="1" noChangeArrowheads="1"/>
+                    </pic:cNvPicPr>
+                  </pic:nvPicPr>
+                  <pic:blipFill>
+                    <a:blip r:embed="rId9">
+                      <a:extLst>
+                        <a:ext uri="{28A0092B-C50C-407E-A947-70E740481C1C}">
+                          <a14:useLocalDpi xmlns:a14="http://schemas.microsoft.com/office/drawing/2010/main" val="0"/>
+                        </a:ext>
+                      </a:extLst>
+                    </a:blip>
+                    <a:srcRect/>
+                    <a:stretch>
+                      <a:fillRect/>
+                    </a:stretch>
+                  </pic:blipFill>
+                  <pic:spPr bwMode="auto">
+                    <a:xfrm>
+                      <a:off x="0" y="0"/>
+                      <a:ext cx="2438400" cy="2438400"/>
+                    </a:xfrm>
+                    <a:prstGeom prst="rect">
+                      <a:avLst/>
+                    </a:prstGeom>
+                    <a:noFill/>
+                    <a:ln>
+                      <a:noFill/>
+                    </a:ln>
+                  </pic:spPr>
+                </pic:pic>
+              </a:graphicData>
+            </a:graphic>
+          </wp:inline>
+        </w:drawing>
+      </w:r>
+    </w:p>
+    <w:p>
+      <w:pPr>
+        <w:pStyle w:val="Caption"/>
+      </w:pPr>
+      <w:r>
+        <w:t>unlimiteddb.net</w:t>
+      </w:r>
+      <w:r>
+        <w:tab/>
+      </w:r>
+      <w:r>
+        <w:tab/>
+      </w:r>
+      <w:r>
+        <w:tab/>
+      </w:r>
+      <w:r>
+        <w:tab/>
+      </w:r>
+      <w:r>
+        <w:tab/>
+      </w:r>
+      <w:r>
+        <w:tab/>
+        <w:t>phandalverse.altervista.org</w:t>
+      </w:r>
     </w:p>
     <w:p>
       <w:pPr>
@@ -1582,6 +1716,25 @@
       <w:contextualSpacing/>
     </w:pPr>
   </w:style>
+  <w:style w:type="paragraph" w:styleId="Caption">
+    <w:name w:val="caption"/>
+    <w:basedOn w:val="Normal"/>
+    <w:next w:val="Normal"/>
+    <w:uiPriority w:val="35"/>
+    <w:unhideWhenUsed/>
+    <w:qFormat/>
+    <w:rsid w:val="00F70BBD"/>
+    <w:pPr>
+      <w:spacing w:after="200" w:line="240" w:lineRule="auto"/>
+    </w:pPr>
+    <w:rPr>
+      <w:i/>
+      <w:iCs/>
+      <w:color w:val="1F497D" w:themeColor="text2"/>
+      <w:sz w:val="18"/>
+      <w:szCs w:val="18"/>
+    </w:rPr>
+  </w:style>
 </w:styles>
 </file>
 

</xml_diff>